<commit_message>
Final QA fixes (D1-D11), complete run_all, table renumbering, submission package
Co-Authored-By: Claude Opus 5.5 <noreply@anthropic.com>
Claude-Session: https://claude.ai/code/session_015g3Be3GGEzRD6VuHY4Trrg
</commit_message>
<xml_diff>
--- a/cross_regional_electricity_forecasting/manuscript/supplementary_material.docx
+++ b/cross_regional_electricity_forecasting/manuscript/supplementary_material.docx
@@ -32376,13 +32376,13 @@
         <w:tblLook w:firstRow="1" w:lastRow="0" w:firstColumn="0" w:lastColumn="0" w:noHBand="0" w:noVBand="0" w:val="0020"/>
       </w:tblPr>
       <w:tblGrid>
-        <w:gridCol w:w="1404"/>
-        <w:gridCol w:w="505"/>
-        <w:gridCol w:w="1965"/>
-        <w:gridCol w:w="898"/>
-        <w:gridCol w:w="505"/>
-        <w:gridCol w:w="1348"/>
-        <w:gridCol w:w="1291"/>
+        <w:gridCol w:w="1375"/>
+        <w:gridCol w:w="495"/>
+        <w:gridCol w:w="2090"/>
+        <w:gridCol w:w="880"/>
+        <w:gridCol w:w="495"/>
+        <w:gridCol w:w="1320"/>
+        <w:gridCol w:w="1265"/>
       </w:tblGrid>
       <w:tr>
         <w:trPr>
@@ -34365,7 +34365,7 @@
                 <w:color w:val="000000"/>
                 <w:sz w:val="16"/>
               </w:rPr>
-              <w:t xml:space="preserve">ACI-CQR-S (gamma source-selected)</w:t>
+              <w:t xml:space="preserve">ACI-CQR-S (γ selected on source BAs)</w:t>
             </w:r>
           </w:p>
         </w:tc>
@@ -34493,7 +34493,7 @@
                 <w:color w:val="000000"/>
                 <w:sz w:val="16"/>
               </w:rPr>
-              <w:t xml:space="preserve">ACI-CQR-S (gamma source-selected)</w:t>
+              <w:t xml:space="preserve">ACI-CQR-S (γ selected on source BAs)</w:t>
             </w:r>
           </w:p>
         </w:tc>
@@ -34621,7 +34621,7 @@
                 <w:color w:val="000000"/>
                 <w:sz w:val="16"/>
               </w:rPr>
-              <w:t xml:space="preserve">ACI-CQR-S (gamma source-selected)</w:t>
+              <w:t xml:space="preserve">ACI-CQR-S (γ selected on source BAs)</w:t>
             </w:r>
           </w:p>
         </w:tc>
@@ -34749,7 +34749,7 @@
                 <w:color w:val="000000"/>
                 <w:sz w:val="16"/>
               </w:rPr>
-              <w:t xml:space="preserve">ACI-CQR-S (gamma source-selected)</w:t>
+              <w:t xml:space="preserve">ACI-CQR-S (γ selected on source BAs)</w:t>
             </w:r>
           </w:p>
         </w:tc>
@@ -34877,7 +34877,7 @@
                 <w:color w:val="000000"/>
                 <w:sz w:val="16"/>
               </w:rPr>
-              <w:t xml:space="preserve">ACI-CQR-S (gamma source-selected)</w:t>
+              <w:t xml:space="preserve">ACI-CQR-S (γ selected on source BAs)</w:t>
             </w:r>
           </w:p>
         </w:tc>
@@ -35005,7 +35005,7 @@
                 <w:color w:val="000000"/>
                 <w:sz w:val="16"/>
               </w:rPr>
-              <w:t xml:space="preserve">ACI-CQR-S (gamma source-selected)</w:t>
+              <w:t xml:space="preserve">ACI-CQR-S (γ selected on source BAs)</w:t>
             </w:r>
           </w:p>
         </w:tc>
@@ -35133,7 +35133,7 @@
                 <w:color w:val="000000"/>
                 <w:sz w:val="16"/>
               </w:rPr>
-              <w:t xml:space="preserve">ACI-CQR-S (gamma source-selected)</w:t>
+              <w:t xml:space="preserve">ACI-CQR-S (γ selected on source BAs)</w:t>
             </w:r>
           </w:p>
         </w:tc>
@@ -35261,7 +35261,7 @@
                 <w:color w:val="000000"/>
                 <w:sz w:val="16"/>
               </w:rPr>
-              <w:t xml:space="preserve">ACI-CQR-S (gamma source-selected)</w:t>
+              <w:t xml:space="preserve">ACI-CQR-S (γ selected on source BAs)</w:t>
             </w:r>
           </w:p>
         </w:tc>
@@ -35389,7 +35389,7 @@
                 <w:color w:val="000000"/>
                 <w:sz w:val="16"/>
               </w:rPr>
-              <w:t xml:space="preserve">ACI-CQR-S (gamma source-selected)</w:t>
+              <w:t xml:space="preserve">ACI-CQR-S (γ selected on source BAs)</w:t>
             </w:r>
           </w:p>
         </w:tc>
@@ -35517,7 +35517,7 @@
                 <w:color w:val="000000"/>
                 <w:sz w:val="16"/>
               </w:rPr>
-              <w:t xml:space="preserve">ACI-CQR-S (gamma source-selected)</w:t>
+              <w:t xml:space="preserve">ACI-CQR-S (γ selected on source BAs)</w:t>
             </w:r>
           </w:p>
         </w:tc>
@@ -35645,7 +35645,7 @@
                 <w:color w:val="000000"/>
                 <w:sz w:val="16"/>
               </w:rPr>
-              <w:t xml:space="preserve">ACI-CQR-S (gamma source-selected)</w:t>
+              <w:t xml:space="preserve">ACI-CQR-S (γ selected on source BAs)</w:t>
             </w:r>
           </w:p>
         </w:tc>
@@ -35773,7 +35773,7 @@
                 <w:color w:val="000000"/>
                 <w:sz w:val="16"/>
               </w:rPr>
-              <w:t xml:space="preserve">ACI-CQR-S (gamma source-selected)</w:t>
+              <w:t xml:space="preserve">ACI-CQR-S (γ selected on source BAs)</w:t>
             </w:r>
           </w:p>
         </w:tc>
@@ -35901,7 +35901,7 @@
                 <w:color w:val="000000"/>
                 <w:sz w:val="16"/>
               </w:rPr>
-              <w:t xml:space="preserve">ACI-CQR-S (gamma source-selected)</w:t>
+              <w:t xml:space="preserve">ACI-CQR-S (γ selected on source BAs)</w:t>
             </w:r>
           </w:p>
         </w:tc>
@@ -36029,7 +36029,7 @@
                 <w:color w:val="000000"/>
                 <w:sz w:val="16"/>
               </w:rPr>
-              <w:t xml:space="preserve">ACI-CQR-S (gamma source-selected)</w:t>
+              <w:t xml:space="preserve">ACI-CQR-S (γ selected on source BAs)</w:t>
             </w:r>
           </w:p>
         </w:tc>
@@ -37949,7 +37949,7 @@
                 <w:color w:val="000000"/>
                 <w:sz w:val="16"/>
               </w:rPr>
-              <w:t xml:space="preserve">ACI-CQR-S (gamma source-selected)</w:t>
+              <w:t xml:space="preserve">ACI-CQR-S (γ selected on source BAs)</w:t>
             </w:r>
           </w:p>
         </w:tc>
@@ -38077,7 +38077,7 @@
                 <w:color w:val="000000"/>
                 <w:sz w:val="16"/>
               </w:rPr>
-              <w:t xml:space="preserve">ACI-CQR-S (gamma source-selected)</w:t>
+              <w:t xml:space="preserve">ACI-CQR-S (γ selected on source BAs)</w:t>
             </w:r>
           </w:p>
         </w:tc>
@@ -38205,7 +38205,7 @@
                 <w:color w:val="000000"/>
                 <w:sz w:val="16"/>
               </w:rPr>
-              <w:t xml:space="preserve">ACI-CQR-S (gamma source-selected)</w:t>
+              <w:t xml:space="preserve">ACI-CQR-S (γ selected on source BAs)</w:t>
             </w:r>
           </w:p>
         </w:tc>
@@ -38333,7 +38333,7 @@
                 <w:color w:val="000000"/>
                 <w:sz w:val="16"/>
               </w:rPr>
-              <w:t xml:space="preserve">ACI-CQR-S (gamma source-selected)</w:t>
+              <w:t xml:space="preserve">ACI-CQR-S (γ selected on source BAs)</w:t>
             </w:r>
           </w:p>
         </w:tc>
@@ -38461,7 +38461,7 @@
                 <w:color w:val="000000"/>
                 <w:sz w:val="16"/>
               </w:rPr>
-              <w:t xml:space="preserve">ACI-CQR-S (gamma source-selected)</w:t>
+              <w:t xml:space="preserve">ACI-CQR-S (γ selected on source BAs)</w:t>
             </w:r>
           </w:p>
         </w:tc>
@@ -38589,7 +38589,7 @@
                 <w:color w:val="000000"/>
                 <w:sz w:val="16"/>
               </w:rPr>
-              <w:t xml:space="preserve">ACI-CQR-S (gamma source-selected)</w:t>
+              <w:t xml:space="preserve">ACI-CQR-S (γ selected on source BAs)</w:t>
             </w:r>
           </w:p>
         </w:tc>
@@ -38717,7 +38717,7 @@
                 <w:color w:val="000000"/>
                 <w:sz w:val="16"/>
               </w:rPr>
-              <w:t xml:space="preserve">ACI-CQR-S (gamma source-selected)</w:t>
+              <w:t xml:space="preserve">ACI-CQR-S (γ selected on source BAs)</w:t>
             </w:r>
           </w:p>
         </w:tc>
@@ -38845,7 +38845,7 @@
                 <w:color w:val="000000"/>
                 <w:sz w:val="16"/>
               </w:rPr>
-              <w:t xml:space="preserve">ACI-CQR-S (gamma source-selected)</w:t>
+              <w:t xml:space="preserve">ACI-CQR-S (γ selected on source BAs)</w:t>
             </w:r>
           </w:p>
         </w:tc>
@@ -38973,7 +38973,7 @@
                 <w:color w:val="000000"/>
                 <w:sz w:val="16"/>
               </w:rPr>
-              <w:t xml:space="preserve">ACI-CQR-S (gamma source-selected)</w:t>
+              <w:t xml:space="preserve">ACI-CQR-S (γ selected on source BAs)</w:t>
             </w:r>
           </w:p>
         </w:tc>
@@ -39101,7 +39101,7 @@
                 <w:color w:val="000000"/>
                 <w:sz w:val="16"/>
               </w:rPr>
-              <w:t xml:space="preserve">ACI-CQR-S (gamma source-selected)</w:t>
+              <w:t xml:space="preserve">ACI-CQR-S (γ selected on source BAs)</w:t>
             </w:r>
           </w:p>
         </w:tc>
@@ -39229,7 +39229,7 @@
                 <w:color w:val="000000"/>
                 <w:sz w:val="16"/>
               </w:rPr>
-              <w:t xml:space="preserve">ACI-CQR-S (gamma source-selected)</w:t>
+              <w:t xml:space="preserve">ACI-CQR-S (γ selected on source BAs)</w:t>
             </w:r>
           </w:p>
         </w:tc>
@@ -39357,7 +39357,7 @@
                 <w:color w:val="000000"/>
                 <w:sz w:val="16"/>
               </w:rPr>
-              <w:t xml:space="preserve">ACI-CQR-S (gamma source-selected)</w:t>
+              <w:t xml:space="preserve">ACI-CQR-S (γ selected on source BAs)</w:t>
             </w:r>
           </w:p>
         </w:tc>
@@ -39485,7 +39485,7 @@
                 <w:color w:val="000000"/>
                 <w:sz w:val="16"/>
               </w:rPr>
-              <w:t xml:space="preserve">ACI-CQR-S (gamma source-selected)</w:t>
+              <w:t xml:space="preserve">ACI-CQR-S (γ selected on source BAs)</w:t>
             </w:r>
           </w:p>
         </w:tc>
@@ -39613,7 +39613,7 @@
                 <w:color w:val="000000"/>
                 <w:sz w:val="16"/>
               </w:rPr>
-              <w:t xml:space="preserve">ACI-CQR-S (gamma source-selected)</w:t>
+              <w:t xml:space="preserve">ACI-CQR-S (γ selected on source BAs)</w:t>
             </w:r>
           </w:p>
         </w:tc>
@@ -41533,7 +41533,7 @@
                 <w:color w:val="000000"/>
                 <w:sz w:val="16"/>
               </w:rPr>
-              <w:t xml:space="preserve">ACI-CQR-S (gamma source-selected)</w:t>
+              <w:t xml:space="preserve">ACI-CQR-S (γ selected on source BAs)</w:t>
             </w:r>
           </w:p>
         </w:tc>
@@ -41661,7 +41661,7 @@
                 <w:color w:val="000000"/>
                 <w:sz w:val="16"/>
               </w:rPr>
-              <w:t xml:space="preserve">ACI-CQR-S (gamma source-selected)</w:t>
+              <w:t xml:space="preserve">ACI-CQR-S (γ selected on source BAs)</w:t>
             </w:r>
           </w:p>
         </w:tc>
@@ -41789,7 +41789,7 @@
                 <w:color w:val="000000"/>
                 <w:sz w:val="16"/>
               </w:rPr>
-              <w:t xml:space="preserve">ACI-CQR-S (gamma source-selected)</w:t>
+              <w:t xml:space="preserve">ACI-CQR-S (γ selected on source BAs)</w:t>
             </w:r>
           </w:p>
         </w:tc>
@@ -41917,7 +41917,7 @@
                 <w:color w:val="000000"/>
                 <w:sz w:val="16"/>
               </w:rPr>
-              <w:t xml:space="preserve">ACI-CQR-S (gamma source-selected)</w:t>
+              <w:t xml:space="preserve">ACI-CQR-S (γ selected on source BAs)</w:t>
             </w:r>
           </w:p>
         </w:tc>
@@ -42045,7 +42045,7 @@
                 <w:color w:val="000000"/>
                 <w:sz w:val="16"/>
               </w:rPr>
-              <w:t xml:space="preserve">ACI-CQR-S (gamma source-selected)</w:t>
+              <w:t xml:space="preserve">ACI-CQR-S (γ selected on source BAs)</w:t>
             </w:r>
           </w:p>
         </w:tc>
@@ -42173,7 +42173,7 @@
                 <w:color w:val="000000"/>
                 <w:sz w:val="16"/>
               </w:rPr>
-              <w:t xml:space="preserve">ACI-CQR-S (gamma source-selected)</w:t>
+              <w:t xml:space="preserve">ACI-CQR-S (γ selected on source BAs)</w:t>
             </w:r>
           </w:p>
         </w:tc>
@@ -42301,7 +42301,7 @@
                 <w:color w:val="000000"/>
                 <w:sz w:val="16"/>
               </w:rPr>
-              <w:t xml:space="preserve">ACI-CQR-S (gamma source-selected)</w:t>
+              <w:t xml:space="preserve">ACI-CQR-S (γ selected on source BAs)</w:t>
             </w:r>
           </w:p>
         </w:tc>
@@ -42429,7 +42429,7 @@
                 <w:color w:val="000000"/>
                 <w:sz w:val="16"/>
               </w:rPr>
-              <w:t xml:space="preserve">ACI-CQR-S (gamma source-selected)</w:t>
+              <w:t xml:space="preserve">ACI-CQR-S (γ selected on source BAs)</w:t>
             </w:r>
           </w:p>
         </w:tc>
@@ -42557,7 +42557,7 @@
                 <w:color w:val="000000"/>
                 <w:sz w:val="16"/>
               </w:rPr>
-              <w:t xml:space="preserve">ACI-CQR-S (gamma source-selected)</w:t>
+              <w:t xml:space="preserve">ACI-CQR-S (γ selected on source BAs)</w:t>
             </w:r>
           </w:p>
         </w:tc>
@@ -42685,7 +42685,7 @@
                 <w:color w:val="000000"/>
                 <w:sz w:val="16"/>
               </w:rPr>
-              <w:t xml:space="preserve">ACI-CQR-S (gamma source-selected)</w:t>
+              <w:t xml:space="preserve">ACI-CQR-S (γ selected on source BAs)</w:t>
             </w:r>
           </w:p>
         </w:tc>
@@ -42813,7 +42813,7 @@
                 <w:color w:val="000000"/>
                 <w:sz w:val="16"/>
               </w:rPr>
-              <w:t xml:space="preserve">ACI-CQR-S (gamma source-selected)</w:t>
+              <w:t xml:space="preserve">ACI-CQR-S (γ selected on source BAs)</w:t>
             </w:r>
           </w:p>
         </w:tc>
@@ -42941,7 +42941,7 @@
                 <w:color w:val="000000"/>
                 <w:sz w:val="16"/>
               </w:rPr>
-              <w:t xml:space="preserve">ACI-CQR-S (gamma source-selected)</w:t>
+              <w:t xml:space="preserve">ACI-CQR-S (γ selected on source BAs)</w:t>
             </w:r>
           </w:p>
         </w:tc>
@@ -43069,7 +43069,7 @@
                 <w:color w:val="000000"/>
                 <w:sz w:val="16"/>
               </w:rPr>
-              <w:t xml:space="preserve">ACI-CQR-S (gamma source-selected)</w:t>
+              <w:t xml:space="preserve">ACI-CQR-S (γ selected on source BAs)</w:t>
             </w:r>
           </w:p>
         </w:tc>
@@ -43197,7 +43197,7 @@
                 <w:color w:val="000000"/>
                 <w:sz w:val="16"/>
               </w:rPr>
-              <w:t xml:space="preserve">ACI-CQR-S (gamma source-selected)</w:t>
+              <w:t xml:space="preserve">ACI-CQR-S (γ selected on source BAs)</w:t>
             </w:r>
           </w:p>
         </w:tc>

</xml_diff>